<commit_message>
Ran analyses and updated results
</commit_message>
<xml_diff>
--- a/Chronic Code/Methodology and Results.docx
+++ b/Chronic Code/Methodology and Results.docx
@@ -3966,14 +3966,7 @@
           <w:b/>
           <w:bCs/>
         </w:rPr>
-        <w:t>Insoluble</w:t>
-      </w:r>
-      <w:r>
-        <w:rPr>
-          <w:b/>
-          <w:bCs/>
-        </w:rPr>
-        <w:t xml:space="preserve"> Results</w:t>
+        <w:t>Insoluble Results</w:t>
       </w:r>
     </w:p>
     <w:p>

</xml_diff>

<commit_message>
BIGGG refactor - new gui layout to be more intuitive, split analysis.py into mutliple component files
</commit_message>
<xml_diff>
--- a/Chronic Code/Methodology and Results.docx
+++ b/Chronic Code/Methodology and Results.docx
@@ -140,11 +140,9 @@
           <w:numId w:val="1"/>
         </w:numPr>
       </w:pPr>
-      <w:proofErr w:type="spellStart"/>
       <w:r>
         <w:t>Sample_ID</w:t>
       </w:r>
-      <w:proofErr w:type="spellEnd"/>
     </w:p>
     <w:p>
       <w:pPr>
@@ -155,23 +153,7 @@
         </w:numPr>
       </w:pPr>
       <w:r>
-        <w:t>Condition (</w:t>
-      </w:r>
-      <w:proofErr w:type="spellStart"/>
-      <w:r>
-        <w:t>Resp</w:t>
-      </w:r>
-      <w:proofErr w:type="spellEnd"/>
-      <w:r>
-        <w:t>/</w:t>
-      </w:r>
-      <w:proofErr w:type="spellStart"/>
-      <w:r>
-        <w:t>NonResp</w:t>
-      </w:r>
-      <w:proofErr w:type="spellEnd"/>
-      <w:r>
-        <w:t>)</w:t>
+        <w:t>Condition (Resp/NonResp)</w:t>
       </w:r>
     </w:p>
     <w:p>
@@ -200,15 +182,7 @@
     </w:p>
     <w:p>
       <w:r>
-        <w:t xml:space="preserve">- time was re-added after initial processing (derived from </w:t>
-      </w:r>
-      <w:proofErr w:type="spellStart"/>
-      <w:r>
-        <w:t>Sample_ID</w:t>
-      </w:r>
-      <w:proofErr w:type="spellEnd"/>
-      <w:r>
-        <w:t>)</w:t>
+        <w:t>- time was re-added after initial processing (derived from Sample_ID)</w:t>
       </w:r>
     </w:p>
     <w:p/>
@@ -234,15 +208,7 @@
         </w:numPr>
       </w:pPr>
       <w:r>
-        <w:t>Convert 0/</w:t>
-      </w:r>
-      <w:proofErr w:type="spellStart"/>
-      <w:r>
-        <w:t>NaN</w:t>
-      </w:r>
-      <w:proofErr w:type="spellEnd"/>
-      <w:r>
-        <w:t xml:space="preserve"> to NA</w:t>
+        <w:t>Convert 0/NaN to NA</w:t>
       </w:r>
     </w:p>
     <w:p>
@@ -457,21 +423,8 @@
         <w:t>Classify samples as either D</w:t>
       </w:r>
       <w:r>
-        <w:t xml:space="preserve">0 or D14, or as either </w:t>
-      </w:r>
-      <w:proofErr w:type="spellStart"/>
-      <w:r>
-        <w:t>Resp</w:t>
-      </w:r>
-      <w:proofErr w:type="spellEnd"/>
-      <w:r>
-        <w:t xml:space="preserve"> or Non-</w:t>
-      </w:r>
-      <w:proofErr w:type="spellStart"/>
-      <w:r>
-        <w:t>Resp</w:t>
-      </w:r>
-      <w:proofErr w:type="spellEnd"/>
+        <w:t>0 or D14, or as either Resp or Non-Resp</w:t>
+      </w:r>
     </w:p>
     <w:p>
       <w:pPr>
@@ -838,13 +791,8 @@
         </w:numPr>
       </w:pPr>
       <w:r>
-        <w:t xml:space="preserve">Perform Limma with </w:t>
-      </w:r>
-      <w:proofErr w:type="spellStart"/>
-      <w:r>
-        <w:t>eBayes</w:t>
-      </w:r>
-      <w:proofErr w:type="spellEnd"/>
+        <w:t>Perform Limma with eBayes</w:t>
+      </w:r>
     </w:p>
     <w:p>
       <w:pPr>
@@ -893,13 +841,8 @@
       <w:r>
         <w:t xml:space="preserve"> (built into R </w:t>
       </w:r>
-      <w:proofErr w:type="spellStart"/>
-      <w:r>
-        <w:t>limma</w:t>
-      </w:r>
-      <w:proofErr w:type="spellEnd"/>
-      <w:r>
-        <w:t xml:space="preserve"> method)</w:t>
+      <w:r>
+        <w:t>limma method)</w:t>
       </w:r>
     </w:p>
     <w:p>
@@ -952,13 +895,8 @@
         </w:numPr>
       </w:pPr>
       <w:r>
-        <w:t xml:space="preserve">ID column: </w:t>
-      </w:r>
-      <w:proofErr w:type="spellStart"/>
-      <w:r>
-        <w:t>Sample_ID</w:t>
-      </w:r>
-      <w:proofErr w:type="spellEnd"/>
+        <w:t>ID column: Sample_ID</w:t>
+      </w:r>
     </w:p>
     <w:p>
       <w:pPr>
@@ -1005,13 +943,8 @@
         </w:numPr>
       </w:pPr>
       <w:r>
-        <w:t xml:space="preserve">Filter Value: </w:t>
-      </w:r>
-      <w:proofErr w:type="spellStart"/>
-      <w:r>
-        <w:t>Resp</w:t>
-      </w:r>
-      <w:proofErr w:type="spellEnd"/>
+        <w:t>Filter Value: Resp</w:t>
+      </w:r>
     </w:p>
     <w:p>
       <w:pPr>
@@ -1097,13 +1030,8 @@
         </w:numPr>
       </w:pPr>
       <w:r>
-        <w:t xml:space="preserve">ID column: </w:t>
-      </w:r>
-      <w:proofErr w:type="spellStart"/>
-      <w:r>
-        <w:t>Sample_ID</w:t>
-      </w:r>
-      <w:proofErr w:type="spellEnd"/>
+        <w:t>ID column: Sample_ID</w:t>
+      </w:r>
     </w:p>
     <w:p>
       <w:pPr>
@@ -1226,13 +1154,8 @@
         </w:numPr>
       </w:pPr>
       <w:r>
-        <w:t xml:space="preserve">ID column: </w:t>
-      </w:r>
-      <w:proofErr w:type="spellStart"/>
-      <w:r>
-        <w:t>Sample_ID</w:t>
-      </w:r>
-      <w:proofErr w:type="spellEnd"/>
+        <w:t>ID column: Sample_ID</w:t>
+      </w:r>
     </w:p>
     <w:p>
       <w:pPr>
@@ -1360,13 +1283,8 @@
         </w:numPr>
       </w:pPr>
       <w:r>
-        <w:t xml:space="preserve">ID column: </w:t>
-      </w:r>
-      <w:proofErr w:type="spellStart"/>
-      <w:r>
-        <w:t>Sample_ID</w:t>
-      </w:r>
-      <w:proofErr w:type="spellEnd"/>
+        <w:t>ID column: Sample_ID</w:t>
+      </w:r>
     </w:p>
     <w:p>
       <w:pPr>

</xml_diff>

<commit_message>
Adjusted variable names and text
</commit_message>
<xml_diff>
--- a/Chronic Code/Methodology and Results.docx
+++ b/Chronic Code/Methodology and Results.docx
@@ -140,9 +140,11 @@
           <w:numId w:val="1"/>
         </w:numPr>
       </w:pPr>
+      <w:proofErr w:type="spellStart"/>
       <w:r>
         <w:t>Sample_ID</w:t>
       </w:r>
+      <w:proofErr w:type="spellEnd"/>
     </w:p>
     <w:p>
       <w:pPr>
@@ -153,7 +155,23 @@
         </w:numPr>
       </w:pPr>
       <w:r>
-        <w:t>Condition (Resp/NonResp)</w:t>
+        <w:t>Condition (</w:t>
+      </w:r>
+      <w:proofErr w:type="spellStart"/>
+      <w:r>
+        <w:t>Resp</w:t>
+      </w:r>
+      <w:proofErr w:type="spellEnd"/>
+      <w:r>
+        <w:t>/</w:t>
+      </w:r>
+      <w:proofErr w:type="spellStart"/>
+      <w:r>
+        <w:t>NonResp</w:t>
+      </w:r>
+      <w:proofErr w:type="spellEnd"/>
+      <w:r>
+        <w:t>)</w:t>
       </w:r>
     </w:p>
     <w:p>
@@ -182,7 +200,15 @@
     </w:p>
     <w:p>
       <w:r>
-        <w:t>- time was re-added after initial processing (derived from Sample_ID)</w:t>
+        <w:t xml:space="preserve">- time was re-added after initial processing (derived from </w:t>
+      </w:r>
+      <w:proofErr w:type="spellStart"/>
+      <w:r>
+        <w:t>Sample_ID</w:t>
+      </w:r>
+      <w:proofErr w:type="spellEnd"/>
+      <w:r>
+        <w:t>)</w:t>
       </w:r>
     </w:p>
     <w:p/>
@@ -208,7 +234,15 @@
         </w:numPr>
       </w:pPr>
       <w:r>
-        <w:t>Convert 0/NaN to NA</w:t>
+        <w:t>Convert 0/</w:t>
+      </w:r>
+      <w:proofErr w:type="spellStart"/>
+      <w:r>
+        <w:t>NaN</w:t>
+      </w:r>
+      <w:proofErr w:type="spellEnd"/>
+      <w:r>
+        <w:t xml:space="preserve"> to NA</w:t>
       </w:r>
     </w:p>
     <w:p>
@@ -423,8 +457,21 @@
         <w:t>Classify samples as either D</w:t>
       </w:r>
       <w:r>
-        <w:t>0 or D14, or as either Resp or Non-Resp</w:t>
-      </w:r>
+        <w:t xml:space="preserve">0 or D14, or as either </w:t>
+      </w:r>
+      <w:proofErr w:type="spellStart"/>
+      <w:r>
+        <w:t>Resp</w:t>
+      </w:r>
+      <w:proofErr w:type="spellEnd"/>
+      <w:r>
+        <w:t xml:space="preserve"> or Non-</w:t>
+      </w:r>
+      <w:proofErr w:type="spellStart"/>
+      <w:r>
+        <w:t>Resp</w:t>
+      </w:r>
+      <w:proofErr w:type="spellEnd"/>
     </w:p>
     <w:p>
       <w:pPr>
@@ -791,8 +838,13 @@
         </w:numPr>
       </w:pPr>
       <w:r>
-        <w:t>Perform Limma with eBayes</w:t>
-      </w:r>
+        <w:t xml:space="preserve">Perform Limma with </w:t>
+      </w:r>
+      <w:proofErr w:type="spellStart"/>
+      <w:r>
+        <w:t>eBayes</w:t>
+      </w:r>
+      <w:proofErr w:type="spellEnd"/>
     </w:p>
     <w:p>
       <w:pPr>
@@ -841,8 +893,13 @@
       <w:r>
         <w:t xml:space="preserve"> (built into R </w:t>
       </w:r>
-      <w:r>
-        <w:t>limma method)</w:t>
+      <w:proofErr w:type="spellStart"/>
+      <w:r>
+        <w:t>limma</w:t>
+      </w:r>
+      <w:proofErr w:type="spellEnd"/>
+      <w:r>
+        <w:t xml:space="preserve"> method)</w:t>
       </w:r>
     </w:p>
     <w:p>
@@ -895,8 +952,13 @@
         </w:numPr>
       </w:pPr>
       <w:r>
-        <w:t>ID column: Sample_ID</w:t>
-      </w:r>
+        <w:t xml:space="preserve">ID column: </w:t>
+      </w:r>
+      <w:proofErr w:type="spellStart"/>
+      <w:r>
+        <w:t>Sample_ID</w:t>
+      </w:r>
+      <w:proofErr w:type="spellEnd"/>
     </w:p>
     <w:p>
       <w:pPr>
@@ -943,8 +1005,13 @@
         </w:numPr>
       </w:pPr>
       <w:r>
-        <w:t>Filter Value: Resp</w:t>
-      </w:r>
+        <w:t xml:space="preserve">Filter Value: </w:t>
+      </w:r>
+      <w:proofErr w:type="spellStart"/>
+      <w:r>
+        <w:t>Resp</w:t>
+      </w:r>
+      <w:proofErr w:type="spellEnd"/>
     </w:p>
     <w:p>
       <w:pPr>
@@ -1030,8 +1097,13 @@
         </w:numPr>
       </w:pPr>
       <w:r>
-        <w:t>ID column: Sample_ID</w:t>
-      </w:r>
+        <w:t xml:space="preserve">ID column: </w:t>
+      </w:r>
+      <w:proofErr w:type="spellStart"/>
+      <w:r>
+        <w:t>Sample_ID</w:t>
+      </w:r>
+      <w:proofErr w:type="spellEnd"/>
     </w:p>
     <w:p>
       <w:pPr>
@@ -1154,8 +1226,13 @@
         </w:numPr>
       </w:pPr>
       <w:r>
-        <w:t>ID column: Sample_ID</w:t>
-      </w:r>
+        <w:t xml:space="preserve">ID column: </w:t>
+      </w:r>
+      <w:proofErr w:type="spellStart"/>
+      <w:r>
+        <w:t>Sample_ID</w:t>
+      </w:r>
+      <w:proofErr w:type="spellEnd"/>
     </w:p>
     <w:p>
       <w:pPr>
@@ -1283,8 +1360,13 @@
         </w:numPr>
       </w:pPr>
       <w:r>
-        <w:t>ID column: Sample_ID</w:t>
-      </w:r>
+        <w:t xml:space="preserve">ID column: </w:t>
+      </w:r>
+      <w:proofErr w:type="spellStart"/>
+      <w:r>
+        <w:t>Sample_ID</w:t>
+      </w:r>
+      <w:proofErr w:type="spellEnd"/>
     </w:p>
     <w:p>
       <w:pPr>

</xml_diff>